<commit_message>
Arbeitsblätter: Kopfzeilen bis Kapitel 12 aktualisiert Merksätze: Obsolete Dateien entfernt Inhalt Programmierkurs: Fehlende Kurseinheit eingetragen
</commit_message>
<xml_diff>
--- a/Doc/Inhalt_Programmierkurs.docx
+++ b/Doc/Inhalt_Programmierkurs.docx
@@ -238,12 +238,14 @@
               <w:rPr>
                 <w:sz w:val="28"/>
                 <w:szCs w:val="28"/>
-              </w:rPr>
-            </w:pPr>
-            <w:r>
-              <w:rPr>
-                <w:sz w:val="28"/>
-                <w:szCs w:val="28"/>
+                <w:lang w:val="en-US"/>
+              </w:rPr>
+            </w:pPr>
+            <w:r>
+              <w:rPr>
+                <w:sz w:val="28"/>
+                <w:szCs w:val="28"/>
+                <w:lang w:val="en-US"/>
               </w:rPr>
               <w:t>IDLE Shell und IDLE Editor</w:t>
             </w:r>
@@ -1409,21 +1411,12 @@
                 <w:szCs w:val="28"/>
               </w:rPr>
             </w:pPr>
-            <w:proofErr w:type="spellStart"/>
-            <w:r>
-              <w:rPr>
-                <w:sz w:val="28"/>
-                <w:szCs w:val="28"/>
-              </w:rPr>
-              <w:t>MicroPython</w:t>
-            </w:r>
-            <w:proofErr w:type="spellEnd"/>
-            <w:r>
-              <w:rPr>
-                <w:sz w:val="28"/>
-                <w:szCs w:val="28"/>
-              </w:rPr>
-              <w:t xml:space="preserve"> und ESP32 – Software und Hardware</w:t>
+            <w:r>
+              <w:rPr>
+                <w:sz w:val="28"/>
+                <w:szCs w:val="28"/>
+              </w:rPr>
+              <w:t>MicroPython und ESP32 – Software und Hardware</w:t>
             </w:r>
           </w:p>
           <w:p>
@@ -1533,14 +1526,7 @@
                 <w:sz w:val="28"/>
                 <w:szCs w:val="28"/>
               </w:rPr>
-              <w:t>Anwendungen</w:t>
-            </w:r>
-            <w:r>
-              <w:rPr>
-                <w:sz w:val="28"/>
-                <w:szCs w:val="28"/>
-              </w:rPr>
-              <w:t xml:space="preserve">: </w:t>
+              <w:t xml:space="preserve">Anwendungen: </w:t>
             </w:r>
             <w:r>
               <w:rPr>
@@ -1637,6 +1623,13 @@
                 <w:szCs w:val="28"/>
               </w:rPr>
             </w:pPr>
+            <w:r>
+              <w:rPr>
+                <w:sz w:val="28"/>
+                <w:szCs w:val="28"/>
+              </w:rPr>
+              <w:t xml:space="preserve">Anwendungen: Hinderniserkennung – Distanzmessung – Einparkhilfe </w:t>
+            </w:r>
           </w:p>
         </w:tc>
         <w:tc>
@@ -1684,6 +1677,13 @@
                 <w:szCs w:val="28"/>
               </w:rPr>
             </w:pPr>
+            <w:r>
+              <w:rPr>
+                <w:sz w:val="28"/>
+                <w:szCs w:val="28"/>
+              </w:rPr>
+              <w:t>18</w:t>
+            </w:r>
           </w:p>
         </w:tc>
       </w:tr>
@@ -1829,7 +1829,7 @@
       <w:rPr>
         <w:noProof/>
       </w:rPr>
-      <w:t>16.03.2026</w:t>
+      <w:t>26.07.2026</w:t>
     </w:r>
     <w:r>
       <w:fldChar w:fldCharType="end"/>

</xml_diff>